<commit_message>
docs: record S164 protocol gateway evidence
</commit_message>
<xml_diff>
--- a/docs/agenthub-master-plan-v1.2.docx
+++ b/docs/agenthub-master-plan-v1.2.docx
@@ -30831,6 +30831,99 @@
     <w:p>
       <w:r>
         <w:t>Evidence: docs/evidence/S163.md</w:t>
+      </w:r>
+    </w:p>
+    <w:p>
+      <w:r>
+        <w:br w:type="page"/>
+      </w:r>
+    </w:p>
+    <w:p>
+      <w:r>
+        <w:rPr>
+          <w:b/>
+        </w:rPr>
+        <w:t>Segment Update: S164</w:t>
+      </w:r>
+    </w:p>
+    <w:p>
+      <w:r>
+        <w:rPr>
+          <w:b w:val="0"/>
+        </w:rPr>
+        <w:t>Date: 2026-08-27</w:t>
+      </w:r>
+    </w:p>
+    <w:p>
+      <w:r>
+        <w:rPr>
+          <w:b w:val="0"/>
+        </w:rPr>
+        <w:t>Status: LOCAL CANDIDATE COMPLETE; release remains unverified by hosted CI and public deployment.</w:t>
+      </w:r>
+    </w:p>
+    <w:p>
+      <w:r>
+        <w:rPr>
+          <w:b w:val="0"/>
+        </w:rPr>
+        <w:t>Scope: MCP Streamable HTTP discovery gateway with exact OAuth resource binding and canonical discovery dispatch.</w:t>
+      </w:r>
+    </w:p>
+    <w:p>
+      <w:r>
+        <w:rPr>
+          <w:b w:val="0"/>
+        </w:rPr>
+        <w:t>Outcomes: added authenticated stateless POST /mcp lifecycle for initialize, initialized notification, ping, tools/list, and tools/call. The gateway exposes search_capabilities, get_agent_manifest, and check_compatibility through existing tenant-aware registry and discovery services, with scope-filtered visibility and call-time enforcement.</w:t>
+      </w:r>
+    </w:p>
+    <w:p>
+      <w:r>
+        <w:rPr>
+          <w:b w:val="0"/>
+        </w:rPr>
+        <w:t>OAuth and security: Protected Resource Metadata now identifies the exact MCP resource; targeted client_credentials tokens carry and verify that audience; invalid and untargeted resources fail at /mcp; audience-bound tokens cannot replay against generic REST routes. Origin, media type, protocol version, JSON-RPC shape, tool arguments, and cross-tenant manifest access fail closed.</w:t>
+      </w:r>
+    </w:p>
+    <w:p>
+      <w:r>
+        <w:rPr>
+          <w:b w:val="0"/>
+        </w:rPr>
+        <w:t>Verification: the official MCP Python SDK 2.1.1 completed real HTTP initialization, tool listing, and discovery invocation. Changed-file Ruff, Pyright, compile, and diff checks passed; packaging and deployment-containment tests passed (8); focused SLA tests passed unchanged (3); full pytest passed (716); Playwright passed (11); deterministic collection found 716 tests.</w:t>
+      </w:r>
+    </w:p>
+    <w:p>
+      <w:r>
+        <w:rPr>
+          <w:b w:val="0"/>
+        </w:rPr>
+        <w:t>Protocol boundary: this segment proves local stateless MCP tool invocation only. It does not claim authorization-code or PKCE OAuth, public-client login, stateful SSE resumption, A2A execution, managed provider execution, public deployment, rollback, or customer ROI.</w:t>
+      </w:r>
+    </w:p>
+    <w:p>
+      <w:r>
+        <w:rPr>
+          <w:b w:val="0"/>
+        </w:rPr>
+        <w:t>Hosted CI: every workflow job is preserved, but automatic push and pull-request triggers are disabled while GitHub billing blocks execution. workflow_dispatch remains available. No hosted green is claimed.</w:t>
+      </w:r>
+    </w:p>
+    <w:p>
+      <w:r>
+        <w:rPr>
+          <w:b w:val="0"/>
+        </w:rPr>
+        <w:t>Next risk boundary: durable tenant-owned capability-token, DID, and verifiable-credential authority with lifecycle-aware verification and revocation.</w:t>
+      </w:r>
+    </w:p>
+    <w:p>
+      <w:r>
+        <w:rPr>
+          <w:b w:val="0"/>
+        </w:rPr>
+        <w:t>Evidence: docs/evidence/S164.md</w:t>
       </w:r>
     </w:p>
     <w:sectPr>

</xml_diff>

<commit_message>
fix(mcp): close interoperability review blockers
</commit_message>
<xml_diff>
--- a/docs/agenthub-master-plan-v1.2.docx
+++ b/docs/agenthub-master-plan-v1.2.docx
@@ -30883,7 +30883,7 @@
         <w:rPr>
           <w:b w:val="0"/>
         </w:rPr>
-        <w:t>OAuth and security: Protected Resource Metadata now identifies the exact MCP resource; targeted client_credentials tokens carry and verify that audience; invalid and untargeted resources fail at /mcp; audience-bound tokens cannot replay against generic REST routes. Origin, media type, protocol version, JSON-RPC shape, tool arguments, and cross-tenant manifest access fail closed.</w:t>
+        <w:t>OAuth and security: Protected Resource Metadata identifies the exact MCP resource; targeted client_credentials tokens carry and verify that audience; invalid and untargeted resources fail at /mcp; audience-bound tokens cannot replay against generic REST routes. The advertised authorization-server issuer now matches OAuth JWT issuance and live verification. Browser preflight admits MCP protocol and tenant headers, while malformed, non-finite, cross-tenant, origin, media, version, and JSON-RPC inputs fail closed.</w:t>
       </w:r>
     </w:p>
     <w:p>
@@ -30891,7 +30891,7 @@
         <w:rPr>
           <w:b w:val="0"/>
         </w:rPr>
-        <w:t>Verification: the official MCP Python SDK 2.1.1 completed real HTTP initialization, tool listing, and discovery invocation. Changed-file Ruff, Pyright, compile, and diff checks passed; packaging and deployment-containment tests passed (8); focused SLA tests passed unchanged (3); full pytest passed (716); Playwright passed (11); deterministic collection found 716 tests.</w:t>
+        <w:t>Verification: the official MCP Python SDK 2.1.1 completed real HTTP initialization, tool listing, and discovery invocation with API-key and OAuth client_credentials authentication. Changed-file Ruff, Pyright, compile, and diff checks passed; packaging and deployment-containment tests passed (8); focused SLA tests passed unchanged (3); full pytest passed (718); Playwright passed (11); deterministic collection found 718 tests.</w:t>
       </w:r>
     </w:p>
     <w:p>

</xml_diff>

<commit_message>
feat(identity): persist capability and credential authority
</commit_message>
<xml_diff>
--- a/docs/agenthub-master-plan-v1.2.docx
+++ b/docs/agenthub-master-plan-v1.2.docx
@@ -30924,6 +30924,74 @@
           <w:b w:val="0"/>
         </w:rPr>
         <w:t>Evidence: docs/evidence/S164.md</w:t>
+      </w:r>
+    </w:p>
+    <w:p>
+      <w:r>
+        <w:br w:type="page"/>
+      </w:r>
+    </w:p>
+    <w:p>
+      <w:r>
+        <w:rPr>
+          <w:b/>
+        </w:rPr>
+        <w:t>Segment Update: S165</w:t>
+      </w:r>
+    </w:p>
+    <w:p>
+      <w:r>
+        <w:t>Date: 2026-08-27</w:t>
+      </w:r>
+    </w:p>
+    <w:p>
+      <w:r>
+        <w:t>Status: LOCAL CANDIDATE COMPLETE; exact-head independent review, hosted CI, and public deployment remain pending.</w:t>
+      </w:r>
+    </w:p>
+    <w:p>
+      <w:r>
+        <w:t>Scope: durable tenant-owned capability-token, DID, and verifiable-credential authority with lifecycle-aware verification and revocation.</w:t>
+      </w:r>
+    </w:p>
+    <w:p>
+      <w:r>
+        <w:t>Outcomes: replaced process-memory authority with additive identity SQLite tables and canonical transactions. Artifacts persist immutable owner, tenant, issuer, subject, audience, resource, expiry, revocation, and identity-generation snapshots. Capability roots now support tenant-scoped get, list, and idempotent revoke operations without exposing bearer material.</w:t>
+      </w:r>
+    </w:p>
+    <w:p>
+      <w:r>
+        <w:t>Security: version-2 capability signatures and DID/VC proofs use protocol domain separation. Issuance requires active same-boundary identities, actor scope authority, and agent-bound self authority. Verification rejects missing or mismatched audience/resource context, body-supplied source IP, cross-boundary access, stale generations, inactive identities, terminal DIDs, revoked artifacts, malformed chains, and legacy version-1 tokens.</w:t>
+      </w:r>
+    </w:p>
+    <w:p>
+      <w:r>
+        <w:t>Lifecycle and recovery: explicit token/VC revocation and agent kill-switch cascade persist across reconfigure. Suspend/reactivate and real configuration changes rotate identity generation so old tokens and VCs stay invalid. Stable active DIDs can issue replacement VCs after legitimate recovery; DID deactivation remains monotonic.</w:t>
+      </w:r>
+    </w:p>
+    <w:p>
+      <w:r>
+        <w:t>Verification: exploit baseline reproduced 22 failures before correction. S165 authorization, persistence, and architecture suites passed (34); proportional security, packaging, and deployment suites passed (99); changed-file Ruff, Pyright, compile, format, and diff checks passed; full pytest passed 749 with one unchanged isolated official-MCP-SDK skip; wheel build and eight packaging/deployment-containment tests passed.</w:t>
+      </w:r>
+    </w:p>
+    <w:p>
+      <w:r>
+        <w:t>Boundary: proof is local single-process SQLite with a configured symmetric secret. This segment does not claim PostgreSQL, multi-worker or multi-replica consistency, KMS custody, asymmetric/public DID verification, full standards conformance, cross-tenant federation, capability-token login, hosted CI, public deployment, rollback execution, provider execution, or customer ROI.</w:t>
+      </w:r>
+    </w:p>
+    <w:p>
+      <w:r>
+        <w:t>Hosted CI: automatic GitHub Actions remain disabled while provider billing prevents execution; the preserved workflow is manual-only and was not dispatched. No hosted green is claimed.</w:t>
+      </w:r>
+    </w:p>
+    <w:p>
+      <w:r>
+        <w:t>Next risk boundary: API-key lifecycle, OAuth client rotation/revocation, audit-wide durability, policy signing/remediation, asymmetric key custody, and deployment readiness remain separate product-completion slices.</w:t>
+      </w:r>
+    </w:p>
+    <w:p>
+      <w:r>
+        <w:t>Evidence: docs/evidence/S165.md</w:t>
       </w:r>
     </w:p>
     <w:sectPr>

</xml_diff>

<commit_message>
docs: close S165 review evidence
</commit_message>
<xml_diff>
--- a/docs/agenthub-master-plan-v1.2.docx
+++ b/docs/agenthub-master-plan-v1.2.docx
@@ -30946,7 +30946,7 @@
     </w:p>
     <w:p>
       <w:r>
-        <w:t>Status: LOCAL CANDIDATE COMPLETE; exact-head independent review, hosted CI, and public deployment remain pending.</w:t>
+        <w:t>Status: LOCAL COMPLETE; hosted CI and public deployment remain unverified.</w:t>
       </w:r>
     </w:p>
     <w:p>
@@ -30956,7 +30956,7 @@
     </w:p>
     <w:p>
       <w:r>
-        <w:t>Outcomes: replaced process-memory authority with additive identity SQLite tables and canonical transactions. Artifacts persist immutable owner, tenant, issuer, subject, audience, resource, expiry, revocation, and identity-generation snapshots. Capability roots now support tenant-scoped get, list, and idempotent revoke operations without exposing bearer material.</w:t>
+        <w:t>Outcomes: replaced process-memory authority with additive identity SQLite tables and canonical transactions. Artifacts persist immutable owner, tenant, issuer, subject, audience, resource, expiry, revocation, and identity-generation snapshots. Capability and VC issuance plus capability revocation require replay-safe idempotency; tenant-scoped metadata never exposes bearer material.</w:t>
       </w:r>
     </w:p>
     <w:p>
@@ -30971,7 +30971,7 @@
     </w:p>
     <w:p>
       <w:r>
-        <w:t>Verification: exploit baseline reproduced 22 failures before correction. S165 authorization, persistence, and architecture suites passed (34); proportional security, packaging, and deployment suites passed (99); changed-file Ruff, Pyright, compile, format, and diff checks passed; full pytest passed 749 with one unchanged isolated official-MCP-SDK skip; wheel build and eight packaging/deployment-containment tests passed.</w:t>
+        <w:t>Verification: the initial exploit baseline reproduced 22 failures. Independent review then found two MEDIUM retry/error-normalization gaps; six focused regressions reproduced them. The corrected candidate passed 61 focused, 117 proportional, and 758 full-suite tests with one unchanged official-MCP-SDK skip. Ruff, Pyright, compile, format, diff, wheel, packaging, and deployment-containment gates passed. The same reviewer approved correction head 02a93e41ea1a53d5a9e4bd715a03c8e357ef46a3 with zero HIGH and zero MEDIUM findings.</w:t>
       </w:r>
     </w:p>
     <w:p>

</xml_diff>

<commit_message>
fix: contain unproven product surfaces
</commit_message>
<xml_diff>
--- a/docs/agenthub-master-plan-v1.2.docx
+++ b/docs/agenthub-master-plan-v1.2.docx
@@ -30992,6 +30992,149 @@
     <w:p>
       <w:r>
         <w:t>Evidence: docs/evidence/S165.md</w:t>
+      </w:r>
+    </w:p>
+    <w:p>
+      <w:r>
+        <w:br w:type="page"/>
+      </w:r>
+    </w:p>
+    <w:p>
+      <w:pPr>
+        <w:spacing w:after="120"/>
+      </w:pPr>
+      <w:r>
+        <w:rPr>
+          <w:b/>
+          <w:sz w:val="28"/>
+        </w:rPr>
+        <w:t>Segment Update: S166</w:t>
+      </w:r>
+    </w:p>
+    <w:p>
+      <w:pPr>
+        <w:spacing w:after="100"/>
+      </w:pPr>
+      <w:r>
+        <w:rPr>
+          <w:b/>
+        </w:rPr>
+        <w:t xml:space="preserve">Date: </w:t>
+      </w:r>
+      <w:r>
+        <w:t>2026-08-27</w:t>
+      </w:r>
+    </w:p>
+    <w:p>
+      <w:pPr>
+        <w:spacing w:after="100"/>
+      </w:pPr>
+      <w:r>
+        <w:rPr>
+          <w:b/>
+        </w:rPr>
+        <w:t xml:space="preserve">Status: </w:t>
+      </w:r>
+      <w:r>
+        <w:t>LOCAL CANDIDATE COMPLETE; exact-commit independent review and merge remain pending.</w:t>
+      </w:r>
+    </w:p>
+    <w:p>
+      <w:pPr>
+        <w:spacing w:after="100"/>
+      </w:pPr>
+      <w:r>
+        <w:rPr>
+          <w:b/>
+        </w:rPr>
+        <w:t xml:space="preserve">Scope: </w:t>
+      </w:r>
+      <w:r>
+        <w:t>Product-truth and unsafe-surface containment for audit items AH-002, AH-003, the reproduced AH-007 delegation gap, AH-009, AH-010, and AH-013.</w:t>
+      </w:r>
+    </w:p>
+    <w:p>
+      <w:pPr>
+        <w:spacing w:after="100"/>
+      </w:pPr>
+      <w:r>
+        <w:rPr>
+          <w:b/>
+        </w:rPr>
+        <w:t xml:space="preserve">Outcomes: </w:t>
+      </w:r>
+      <w:r>
+        <w:t>Every OpenAPI operation is classified as prototype, stub, or deferred, with no production labels. Unsafe financial mutations are disabled before idempotency or business persistence by default. Delegation status is owner/tenant bound. SQLite startup rejects declared multi-worker/multi-replica use and competing process ownership.</w:t>
+      </w:r>
+    </w:p>
+    <w:p>
+      <w:pPr>
+        <w:spacing w:after="100"/>
+      </w:pPr>
+      <w:r>
+        <w:rPr>
+          <w:b/>
+        </w:rPr>
+        <w:t xml:space="preserve">Truth boundary: </w:t>
+      </w:r>
+      <w:r>
+        <w:t>Runtime responses now identify local state simulation, no workload execution, no isolation enforcement, and caller-supplied completion. Webhook intent and retry paths no longer report network delivery. README, marketing, and the evidence ledger no longer turn historical segment completion into production or customer-readiness claims.</w:t>
+      </w:r>
+    </w:p>
+    <w:p>
+      <w:pPr>
+        <w:spacing w:after="100"/>
+      </w:pPr>
+      <w:r>
+        <w:rPr>
+          <w:b/>
+        </w:rPr>
+        <w:t xml:space="preserve">Verification: </w:t>
+      </w:r>
+      <w:r>
+        <w:t>The exact merged base reproduced two failures: a billing write returned 200 by default and a foreign owner read delegation status with 200. The S166 candidate passed 65 focused tests, 770 full-suite tests with one unchanged opt-in MCP SDK skip, 8 packaging/deployment-containment tests, Ruff, Pyright, compile, diff, two strict dependency audits, 11 Playwright flows, and a clean Python 3.12 image boot/readiness/OpenAPI/default-disabled-financial probe.</w:t>
+      </w:r>
+    </w:p>
+    <w:p>
+      <w:pPr>
+        <w:spacing w:after="100"/>
+      </w:pPr>
+      <w:r>
+        <w:rPr>
+          <w:b/>
+        </w:rPr>
+        <w:t xml:space="preserve">Boundary: </w:t>
+      </w:r>
+      <w:r>
+        <w:t>Financial integrity is not repaired; those mutations are disabled. No real upstream MCP call, receipt, webhook transport, approval resumption, PostgreSQL/Redis topology, multi-replica consistency, hosted CI, public deployment, or customer outcome is claimed.</w:t>
+      </w:r>
+    </w:p>
+    <w:p>
+      <w:pPr>
+        <w:spacing w:after="100"/>
+      </w:pPr>
+      <w:r>
+        <w:rPr>
+          <w:b/>
+        </w:rPr>
+        <w:t xml:space="preserve">Plan: </w:t>
+      </w:r>
+      <w:r>
+        <w:t>docs/AUDIT_REMEDIATION_PLAN_2026-08-27.md is the canonical AH-001 through AH-052 dependency baseline. S167 is limited to one allowlisted read-only governed MCP relay with durable admission/outcome, asymmetric receipt verification, revocation denial, and crash-ambiguity proof.</w:t>
+      </w:r>
+    </w:p>
+    <w:p>
+      <w:pPr>
+        <w:spacing w:after="100"/>
+      </w:pPr>
+      <w:r>
+        <w:rPr>
+          <w:b/>
+        </w:rPr>
+        <w:t xml:space="preserve">Evidence: </w:t>
+      </w:r>
+      <w:r>
+        <w:t>docs/evidence/S166.md</w:t>
       </w:r>
     </w:p>
     <w:sectPr>

</xml_diff>

<commit_message>
docs: finalize S166 evidence
</commit_message>
<xml_diff>
--- a/docs/agenthub-master-plan-v1.2.docx
+++ b/docs/agenthub-master-plan-v1.2.docx
@@ -31030,13 +31030,21 @@
         <w:spacing w:after="100"/>
       </w:pPr>
       <w:r>
+        <w:t>Status: LOCAL COMPLETE; independent exact-commit review approved the corrected code candidate, and merge remains pending.</w:t>
+      </w:r>
+    </w:p>
+    <w:p>
+      <w:pPr>
+        <w:spacing w:after="100"/>
+      </w:pPr>
+      <w:r>
         <w:rPr>
           <w:b/>
         </w:rPr>
-        <w:t xml:space="preserve">Status: </w:t>
-      </w:r>
-      <w:r>
-        <w:t>LOCAL CANDIDATE COMPLETE; exact-commit independent review and merge remain pending.</w:t>
+        <w:t xml:space="preserve">Scope: </w:t>
+      </w:r>
+      <w:r>
+        <w:t>Product-truth and unsafe-surface containment for audit items AH-002, AH-003, the reproduced AH-007 delegation gap, AH-009, AH-010, and AH-013.</w:t>
       </w:r>
     </w:p>
     <w:p>
@@ -31047,10 +31055,10 @@
         <w:rPr>
           <w:b/>
         </w:rPr>
-        <w:t xml:space="preserve">Scope: </w:t>
-      </w:r>
-      <w:r>
-        <w:t>Product-truth and unsafe-surface containment for audit items AH-002, AH-003, the reproduced AH-007 delegation gap, AH-009, AH-010, and AH-013.</w:t>
+        <w:t xml:space="preserve">Outcomes: </w:t>
+      </w:r>
+      <w:r>
+        <w:t>Every OpenAPI operation is classified as prototype, stub, or deferred, with no production labels. Unsafe financial mutations are disabled before idempotency or business persistence by default. Delegation status is owner/tenant bound. SQLite startup rejects declared multi-worker/multi-replica use and competing process ownership.</w:t>
       </w:r>
     </w:p>
     <w:p>
@@ -31061,10 +31069,10 @@
         <w:rPr>
           <w:b/>
         </w:rPr>
-        <w:t xml:space="preserve">Outcomes: </w:t>
-      </w:r>
-      <w:r>
-        <w:t>Every OpenAPI operation is classified as prototype, stub, or deferred, with no production labels. Unsafe financial mutations are disabled before idempotency or business persistence by default. Delegation status is owner/tenant bound. SQLite startup rejects declared multi-worker/multi-replica use and competing process ownership.</w:t>
+        <w:t xml:space="preserve">Truth boundary: </w:t>
+      </w:r>
+      <w:r>
+        <w:t>Runtime responses now identify local state simulation, no workload execution, no isolation enforcement, and caller-supplied completion. Webhook intent and retry paths no longer report network delivery. README, marketing, and the evidence ledger no longer turn historical segment completion into production or customer-readiness claims.</w:t>
       </w:r>
     </w:p>
     <w:p>
@@ -31072,27 +31080,7 @@
         <w:spacing w:after="100"/>
       </w:pPr>
       <w:r>
-        <w:rPr>
-          <w:b/>
-        </w:rPr>
-        <w:t xml:space="preserve">Truth boundary: </w:t>
-      </w:r>
-      <w:r>
-        <w:t>Runtime responses now identify local state simulation, no workload execution, no isolation enforcement, and caller-supplied completion. Webhook intent and retry paths no longer report network delivery. README, marketing, and the evidence ledger no longer turn historical segment completion into production or customer-readiness claims.</w:t>
-      </w:r>
-    </w:p>
-    <w:p>
-      <w:pPr>
-        <w:spacing w:after="100"/>
-      </w:pPr>
-      <w:r>
-        <w:rPr>
-          <w:b/>
-        </w:rPr>
-        <w:t xml:space="preserve">Verification: </w:t>
-      </w:r>
-      <w:r>
-        <w:t>The exact merged base reproduced two failures: a billing write returned 200 by default and a foreign owner read delegation status with 200. The S166 candidate passed 65 focused tests, 770 full-suite tests with one unchanged opt-in MCP SDK skip, 8 packaging/deployment-containment tests, Ruff, Pyright, compile, diff, two strict dependency audits, 11 Playwright flows, and a clean Python 3.12 image boot/readiness/OpenAPI/default-disabled-financial probe.</w:t>
+        <w:t>Verification: The exact merged base reproduced two failures: a billing write returned 200 by default and a foreign owner read delegation status with 200. The corrected candidate passed 65 focused tests, 770 full-suite tests with one unchanged opt-in MCP SDK skip, 8 packaging/deployment-containment tests, Ruff, Pyright, compile, diff, two strict dependency audits, 11 Playwright flows, and exact-image readiness/simulation/webhook/default-disabled-financial probes. The same independent xhigh reviewer approved corrected head 99bd540b8e62caf2aa6540304c22514170001e52 with zero HIGH and zero MEDIUM findings.</w:t>
       </w:r>
     </w:p>
     <w:p>

</xml_diff>

<commit_message>
feat(relay): add governed MCP execution boundary
</commit_message>
<xml_diff>
--- a/docs/agenthub-master-plan-v1.2.docx
+++ b/docs/agenthub-master-plan-v1.2.docx
@@ -31123,6 +31123,121 @@
       </w:r>
       <w:r>
         <w:t>docs/evidence/S166.md</w:t>
+      </w:r>
+    </w:p>
+    <w:p>
+      <w:r>
+        <w:br w:type="page"/>
+      </w:r>
+    </w:p>
+    <w:p>
+      <w:pPr>
+        <w:spacing w:after="120"/>
+      </w:pPr>
+      <w:r>
+        <w:rPr>
+          <w:b/>
+          <w:sz w:val="28"/>
+        </w:rPr>
+        <w:t>Segment Update: S167</w:t>
+      </w:r>
+    </w:p>
+    <w:p>
+      <w:pPr>
+        <w:spacing w:after="100"/>
+      </w:pPr>
+      <w:r>
+        <w:rPr>
+          <w:b/>
+        </w:rPr>
+        <w:t xml:space="preserve">Date: </w:t>
+      </w:r>
+      <w:r>
+        <w:t>2026-08-27</w:t>
+      </w:r>
+    </w:p>
+    <w:p>
+      <w:pPr>
+        <w:spacing w:after="100"/>
+      </w:pPr>
+      <w:r>
+        <w:t>Status: LOCAL CANDIDATE COMPLETE; exact image, independent exact-commit review, PR merge, hosted deployment, and customer proof remain pending.</w:t>
+      </w:r>
+    </w:p>
+    <w:p>
+      <w:pPr>
+        <w:spacing w:after="100"/>
+      </w:pPr>
+      <w:r>
+        <w:t>Scope: Governed MCP relay v0 for one exact operator-attested, server-declared read-only/idempotent, auth-none upstream tool. MCP annotations are untrusted hints; no request field selects an endpoint or tool, and technical prevention of upstream side effects is not claimed.</w:t>
+      </w:r>
+    </w:p>
+    <w:p>
+      <w:pPr>
+        <w:spacing w:after="100"/>
+      </w:pPr>
+      <w:r>
+        <w:t>Outcomes: The production runtime uses the official MCP 2.1.1 client. Import persists server/protocol identity, strict schemas, annotations, operator attestation, and the full tool-contract digest. Calls require an agent-bound revocation-aware principal, relay.call, and exact durable capability audience, resource, subject, and tool scope. OpenAPI records the real public/protected authentication boundary.</w:t>
+      </w:r>
+    </w:p>
+    <w:p>
+      <w:pPr>
+        <w:spacing w:after="100"/>
+      </w:pPr>
+      <w:r>
+        <w:t>Dispatch and cost boundary: Principal, capability, configuration generation, final target, policy, and admin-controlled finite budget are checked under one local authority fence immediately before network admission. The immutable final target snapshot is persisted with network_started_at. Fresh server identity, protocol, and schema are compared before tools/call; redirects and retries are disabled.</w:t>
+      </w:r>
+    </w:p>
+    <w:p>
+      <w:pPr>
+        <w:spacing w:after="100"/>
+      </w:pPr>
+      <w:r>
+        <w:t>Reliability and evidence: Domain idempotency persists pending, succeeded, failed, and indeterminate outcomes with cross-agent isolation. Connect/discovery failures are definite and uncharged. Crash recovery runs only after singleton ownership, repairs receiptless terminal rows, uses the admitted target snapshot, and never replays ambiguous work. API receipt verification trusts only the configured signer; explicit-key verification remains offline.</w:t>
+      </w:r>
+    </w:p>
+    <w:p>
+      <w:pPr>
+        <w:spacing w:after="100"/>
+      </w:pPr>
+      <w:r>
+        <w:t>Verification: The official MCP server ran in a separate process and both real API/crash journeys passed. Relay tests: 101 passed. Proportional focused gates: 150 passed, 1 skipped. Full repository: 873 passed, 1 unchanged optional external-interpreter lane skipped. Thirty-three changed Python files passed Ruff format/check, Pyright, and compile; 8 packaging/deployment tests and both strict dependency audits passed. The clean wheel SHA-256 is 69bc7a4f7ff50643ae1e72c8a6d7779753c59cf4d9080890bcb9c36134627d82. Playwright passed 2 desktop/mobile marketing tests and the final page render was visually clean.</w:t>
+      </w:r>
+    </w:p>
+    <w:p>
+      <w:pPr>
+        <w:spacing w:after="100"/>
+      </w:pPr>
+      <w:r>
+        <w:t>Boundary: This is single-process SQLite local evidence for one operator-attested, server-declared read-only tool. Upstream behavior is not technically constrained. Upstream authentication, write tools, multiple targets, arbitrary routing, approvals, PostgreSQL/Redis, multi-worker or multi-replica safety, OpenTelemetry, hosted CI, public deployment, human login, customer onboarding, pilots, ROI, and customer outcomes are not claimed. Production and customer-pilot verdict remains NO-GO.</w:t>
+      </w:r>
+    </w:p>
+    <w:p>
+      <w:pPr>
+        <w:spacing w:after="100"/>
+      </w:pPr>
+      <w:r>
+        <w:rPr>
+          <w:b/>
+        </w:rPr>
+        <w:t xml:space="preserve">Next dependency: </w:t>
+      </w:r>
+      <w:r>
+        <w:t>Shared data authority: PostgreSQL and Alembic ownership plus transactional outbox semantics; Redis only for a measured cross-process coordination requirement.</w:t>
+      </w:r>
+    </w:p>
+    <w:p>
+      <w:pPr>
+        <w:spacing w:after="100"/>
+      </w:pPr>
+      <w:r>
+        <w:rPr>
+          <w:b/>
+        </w:rPr>
+        <w:t xml:space="preserve">Evidence: </w:t>
+      </w:r>
+      <w:r>
+        <w:t>docs/evidence/S167.md</w:t>
       </w:r>
     </w:p>
     <w:sectPr>

</xml_diff>

<commit_message>
docs(relay): close S167 evidence
</commit_message>
<xml_diff>
--- a/docs/agenthub-master-plan-v1.2.docx
+++ b/docs/agenthub-master-plan-v1.2.docx
@@ -31161,7 +31161,7 @@
         <w:spacing w:after="100"/>
       </w:pPr>
       <w:r>
-        <w:t>Status: LOCAL CANDIDATE COMPLETE; exact image, independent exact-commit review, PR merge, hosted deployment, and customer proof remain pending.</w:t>
+        <w:t>Status: LOCAL COMPLETE; final exact code head approved with zero HIGH/MEDIUM findings. PR merge and post-merge verification occur after this document freeze; hosted deployment and customer proof remain unverified.</w:t>
       </w:r>
     </w:p>
     <w:p>
@@ -31177,7 +31177,7 @@
         <w:spacing w:after="100"/>
       </w:pPr>
       <w:r>
-        <w:t>Outcomes: The production runtime uses the official MCP 2.1.1 client. Import persists server/protocol identity, strict schemas, annotations, operator attestation, and the full tool-contract digest. Calls require an agent-bound revocation-aware principal, relay.call, and exact durable capability audience, resource, subject, and tool scope. OpenAPI records the real public/protected authentication boundary.</w:t>
+        <w:t>Outcomes: The production runtime uses the official MCP 2.1.1 client. Import persists server/protocol identity, strict schemas, annotations, operator attestation, and the full tool-contract digest. Calls require an agent-bound revocation-aware principal, relay.call, and literal exact durable capability audience, resource, subject, and tool scope; wildcard-only scope is denied. OpenAPI records the real public/protected authentication boundary.</w:t>
       </w:r>
     </w:p>
     <w:p>
@@ -31193,7 +31193,7 @@
         <w:spacing w:after="100"/>
       </w:pPr>
       <w:r>
-        <w:t>Reliability and evidence: Domain idempotency persists pending, succeeded, failed, and indeterminate outcomes with cross-agent isolation. Connect/discovery failures are definite and uncharged. Crash recovery runs only after singleton ownership, repairs receiptless terminal rows, uses the admitted target snapshot, and never replays ambiguous work. API receipt verification trusts only the configured signer; explicit-key verification remains offline.</w:t>
+        <w:t>Reliability and evidence: Relay-domain idempotency owns the call outside generic response-cache middleware and requires an explicit key. Reservation atomically snapshots the imported target. Crash recovery runs only after singleton ownership, signs pre-dispatch failure and post-dispatch indeterminate outcomes, and never replays ambiguous work. HTTP bodies and complete results are bounded to 65,536 bytes; identity encoding is forced and encoded responses are rejected before iteration. API receipt verification trusts only the configured signer; explicit-key verification remains offline.</w:t>
       </w:r>
     </w:p>
     <w:p>
@@ -31201,7 +31201,7 @@
         <w:spacing w:after="100"/>
       </w:pPr>
       <w:r>
-        <w:t>Verification: The official MCP server ran in a separate process and both real API/crash journeys passed. Relay tests: 101 passed. Proportional focused gates: 150 passed, 1 skipped. Full repository: 873 passed, 1 unchanged optional external-interpreter lane skipped. Thirty-three changed Python files passed Ruff format/check, Pyright, and compile; 8 packaging/deployment tests and both strict dependency audits passed. The clean wheel SHA-256 is 69bc7a4f7ff50643ae1e72c8a6d7779753c59cf4d9080890bcb9c36134627d82. Playwright passed 2 desktop/mobile marketing tests and the final page render was visually clean.</w:t>
+        <w:t>Verification: Four official-process tests passed. Relay: 125 passed. Proportional: 174 passed, 1 skipped. Full repository: 897 passed, 1 unchanged optional external-interpreter lane skipped. Thirty-four Python files passed Ruff format/check, Pyright, and compile; 8 packaging/deployment tests, both strict dependency audits, and 2 Playwright desktop/mobile tests passed. Final head 42cf66f8bd9a4cb882335ed24a0293d6a3d9500f, tree 488995b1972eb9539e563e4bb99321d9d028fa41, produced exact image sha256:91acc73bf2c7e43cefee7c6b98f403e7968df85672da30a8e673b94d87bb0a20 and wheel SHA-256 4e4098848e3920d8ca96098e07d80bb90a3d7c4d37a402a6542534bc4641cedb. The same xhigh reviewer approved with zero HIGH and zero MEDIUM findings.</w:t>
       </w:r>
     </w:p>
     <w:p>
@@ -31223,7 +31223,7 @@
         <w:t xml:space="preserve">Next dependency: </w:t>
       </w:r>
       <w:r>
-        <w:t>Shared data authority: PostgreSQL and Alembic ownership plus transactional outbox semantics; Redis only for a measured cross-process coordination requirement.</w:t>
+        <w:t>Validation freeze. Do not start PostgreSQL/Alembic/outbox, Redis, broader runtime, marketplace expansion, or public deployment until independent design-partner demand, reliability, ROI, and unit-economic gates justify reopening AgentHub.</w:t>
       </w:r>
     </w:p>
     <w:p>

</xml_diff>

<commit_message>
docs: close merged S167 evidence boundary
</commit_message>
<xml_diff>
--- a/docs/agenthub-master-plan-v1.2.docx
+++ b/docs/agenthub-master-plan-v1.2.docx
@@ -31161,7 +31161,13 @@
         <w:spacing w:after="100"/>
       </w:pPr>
       <w:r>
-        <w:t>Status: LOCAL COMPLETE; final exact code head approved with zero HIGH/MEDIUM findings. PR merge and post-merge verification occur after this document freeze; hosted deployment and customer proof remain unverified.</w:t>
+        <w:rPr>
+          <w:b/>
+        </w:rPr>
+        <w:t>Status:</w:t>
+      </w:r>
+      <w:r>
+        <w:t xml:space="preserve"> MERGED BASELINE; POST-MERGE CORRECTIONS LOCALLY VERIFIED. PR #5 merged S167 at adccd28eb6a0e1a8bfdb779341f28dbc15213e11. Independent review and merge of the corrections remain pending. No hosted or customer proof.</w:t>
       </w:r>
     </w:p>
     <w:p>
@@ -31177,7 +31183,13 @@
         <w:spacing w:after="100"/>
       </w:pPr>
       <w:r>
-        <w:t>Outcomes: The production runtime uses the official MCP 2.1.1 client. Import persists server/protocol identity, strict schemas, annotations, operator attestation, and the full tool-contract digest. Calls require an agent-bound revocation-aware principal, relay.call, and literal exact durable capability audience, resource, subject, and tool scope; wildcard-only scope is denied. OpenAPI records the real public/protected authentication boundary.</w:t>
+        <w:rPr>
+          <w:b/>
+        </w:rPr>
+        <w:t>Outcomes:</w:t>
+      </w:r>
+      <w:r>
+        <w:t xml:space="preserve"> The official MCP 2.1.1 client imports server/protocol identity, strict schemas, annotations, operator attestation, and the complete contract digest. Calls require an agent-bound revocation-aware principal, relay.call, and exact durable capability audience, resource, subject, and tool scope. All 448 OpenAPI operations are explicitly prototype, stub, or deferred; unknown operations fail closed as stub.</w:t>
       </w:r>
     </w:p>
     <w:p>
@@ -31185,7 +31197,13 @@
         <w:spacing w:after="100"/>
       </w:pPr>
       <w:r>
-        <w:t>Dispatch and cost boundary: Principal, capability, configuration generation, final target, policy, and admin-controlled finite budget are checked under one local authority fence immediately before network admission. The immutable final target snapshot is persisted with network_started_at. Fresh server identity, protocol, and schema are compared before tools/call; redirects and retries are disabled.</w:t>
+        <w:rPr>
+          <w:b/>
+        </w:rPr>
+        <w:t>Dispatch and cost boundary:</w:t>
+      </w:r>
+      <w:r>
+        <w:t xml:space="preserve"> Discovery is limited to 32 pages, 256 tools per page, 1,024 tools total, and one deadline; bad or repeated cursors fail closed. Immediately before tools/call, the service reacquires the authority fence, reloads principal, capability, target, configuration, and policy, confirms the immutable snapshot, and records network_started_at. No await separates that callback from dispatch; redirects and retries are disabled.</w:t>
       </w:r>
     </w:p>
     <w:p>
@@ -31201,7 +31219,13 @@
         <w:spacing w:after="100"/>
       </w:pPr>
       <w:r>
-        <w:t>Verification: Four official-process tests passed. Relay: 125 passed. Proportional: 174 passed, 1 skipped. Full repository: 897 passed, 1 unchanged optional external-interpreter lane skipped. Thirty-four Python files passed Ruff format/check, Pyright, and compile; 8 packaging/deployment tests, both strict dependency audits, and 2 Playwright desktop/mobile tests passed. Final head 42cf66f8bd9a4cb882335ed24a0293d6a3d9500f, tree 488995b1972eb9539e563e4bb99321d9d028fa41, produced exact image sha256:91acc73bf2c7e43cefee7c6b98f403e7968df85672da30a8e673b94d87bb0a20 and wheel SHA-256 4e4098848e3920d8ca96098e07d80bb90a3d7c4d37a402a6542534bc4641cedb. The same xhigh reviewer approved with zero HIGH and zero MEDIUM findings.</w:t>
+        <w:rPr>
+          <w:b/>
+        </w:rPr>
+        <w:t>Verification:</w:t>
+      </w:r>
+      <w:r>
+        <w:t xml:space="preserve"> Merged S167 passed 125 relay and 897 full-repository tests with one unchanged optional skip, exact-image proof, and same-reviewer approval with zero HIGH/MEDIUM findings. Post-merge code head 00c6182, tree 0a7edefd3de8efa4e0132739093eb07e9454c0fc, passed 139 relay and 913 full-repository tests with one skip, plus 22 packaging, deployment-containment, official-process, and product-truth tests, Ruff, Pyright, and compile. Its exact-commit review and merge remain pending.</w:t>
       </w:r>
     </w:p>
     <w:p>
@@ -31220,10 +31244,10 @@
         <w:rPr>
           <w:b/>
         </w:rPr>
-        <w:t xml:space="preserve">Next dependency: </w:t>
-      </w:r>
-      <w:r>
-        <w:t>Validation freeze. Do not start PostgreSQL/Alembic/outbox, Redis, broader runtime, marketplace expansion, or public deployment until independent design-partner demand, reliability, ROI, and unit-economic gates justify reopening AgentHub.</w:t>
+        <w:t>Next dependency:</w:t>
+      </w:r>
+      <w:r>
+        <w:t xml:space="preserve"> VALIDATION FREEZE. Do not start shared data, broader runtime, marketplace, deployment, or customer-product expansion. Reopen only for an identified design partner with a written workflow/threat boundary, real governed-call demand, an accountable pilot owner, and explicit owner authorization. Production still requires measured reliability, ROI, unit economics, and end-to-end safety proof.</w:t>
       </w:r>
     </w:p>
     <w:p>

</xml_diff>

<commit_message>
docs: record S167 correction review
</commit_message>
<xml_diff>
--- a/docs/agenthub-master-plan-v1.2.docx
+++ b/docs/agenthub-master-plan-v1.2.docx
@@ -31167,7 +31167,7 @@
         <w:t>Status:</w:t>
       </w:r>
       <w:r>
-        <w:t xml:space="preserve"> MERGED BASELINE; POST-MERGE CORRECTIONS LOCALLY VERIFIED. PR #5 merged S167 at adccd28eb6a0e1a8bfdb779341f28dbc15213e11. Independent review and merge of the corrections remain pending. No hosted or customer proof.</w:t>
+        <w:t xml:space="preserve"> MERGED BASELINE; CORRECTED HEAD LOCALLY VERIFIED. PR #5 merged S167 at adccd28eb6a0e1a8bfdb779341f28dbc15213e11. The first exact review admitted one MEDIUM MCP teardown defect; c158421d18ef5af87a3dc70524a5a00fcc1ec4d6 corrects it. Same-reviewer re-review and merge remain pending. No hosted or customer proof.</w:t>
       </w:r>
     </w:p>
     <w:p>
@@ -31189,7 +31189,7 @@
         <w:t>Outcomes:</w:t>
       </w:r>
       <w:r>
-        <w:t xml:space="preserve"> The official MCP 2.1.1 client imports server/protocol identity, strict schemas, annotations, operator attestation, and the complete contract digest. Calls require an agent-bound revocation-aware principal, relay.call, and exact durable capability audience, resource, subject, and tool scope. All 448 OpenAPI operations are explicitly prototype, stub, or deferred; unknown operations fail closed as stub.</w:t>
+        <w:t xml:space="preserve"> The official MCP 2.1.1 client imports server/protocol identity, strict schemas, annotations, operator attestation, and the complete contract digest. Calls require an agent-bound revocation-aware principal, relay.call, and exact durable capability authority. All 448 OpenAPI operations are classified; the 369 accepted prototypes are explicit method/path pairs, so any new method or route defaults to stub.</w:t>
       </w:r>
     </w:p>
     <w:p>
@@ -31203,7 +31203,7 @@
         <w:t>Dispatch and cost boundary:</w:t>
       </w:r>
       <w:r>
-        <w:t xml:space="preserve"> Discovery is limited to 32 pages, 256 tools per page, 1,024 tools total, and one deadline; bad or repeated cursors fail closed. Immediately before tools/call, the service reacquires the authority fence, reloads principal, capability, target, configuration, and policy, confirms the immutable snapshot, and records network_started_at. No await separates that callback from dispatch; redirects and retries are disabled.</w:t>
+        <w:t xml:space="preserve"> Discovery is limited to 32 pages, 256 tools per page, 1,024 tools total, and one deadline; bad or repeated cursors fail closed. Immediately before tools/call, the service reacquires the authority fence and rechecks principal, capability, target, configuration, and policy. Nested SDK teardown groups preserve the original listing or admission error, preventing double finalization. Redirects and retries are disabled.</w:t>
       </w:r>
     </w:p>
     <w:p>
@@ -31225,7 +31225,7 @@
         <w:t>Verification:</w:t>
       </w:r>
       <w:r>
-        <w:t xml:space="preserve"> Merged S167 passed 125 relay and 897 full-repository tests with one unchanged optional skip, exact-image proof, and same-reviewer approval with zero HIGH/MEDIUM findings. Post-merge code head 00c6182, tree 0a7edefd3de8efa4e0132739093eb07e9454c0fc, passed 139 relay and 913 full-repository tests with one skip, plus 22 packaging, deployment-containment, official-process, and product-truth tests, Ruff, Pyright, and compile. Its exact-commit review and merge remain pending.</w:t>
+        <w:t xml:space="preserve"> Merged S167 passed 125 relay and 897 full-repository tests with one optional skip, exact-image proof, and same-reviewer approval. Corrected code head c158421d18ef5af87a3dc70524a5a00fcc1ec4d6, tree 392314058472ccbae8aa7be19d5d2c64db7aeca9, passed 143 relay and 917 full-repository tests with one skip, plus 24 packaging, containment, official-process, and product-truth tests, Ruff, Pyright, and compile. Real MCP 2.1.1 regressions prove stable repeated-cursor 502 and final-admission 403 outcomes with no dispatch or charge. Re-review remains pending.</w:t>
       </w:r>
     </w:p>
     <w:p>

</xml_diff>

<commit_message>
docs: record approved S167 correction
</commit_message>
<xml_diff>
--- a/docs/agenthub-master-plan-v1.2.docx
+++ b/docs/agenthub-master-plan-v1.2.docx
@@ -31167,7 +31167,7 @@
         <w:t>Status:</w:t>
       </w:r>
       <w:r>
-        <w:t xml:space="preserve"> MERGED BASELINE; CORRECTED HEAD LOCALLY VERIFIED. PR #5 merged S167 at adccd28eb6a0e1a8bfdb779341f28dbc15213e11. The first exact review admitted one MEDIUM MCP teardown defect; c158421d18ef5af87a3dc70524a5a00fcc1ec4d6 corrects it. Same-reviewer re-review and merge remain pending. No hosted or customer proof.</w:t>
+        <w:t xml:space="preserve"> CORRECTION APPROVED; MERGE PENDING. PR #5 merged the baseline. The first exact review found one MEDIUM MCP teardown defect, fixed at c158421d. The same reviewer approved 030974c with zero HIGH/MEDIUM. No hosted or customer proof.</w:t>
       </w:r>
     </w:p>
     <w:p>
@@ -31225,7 +31225,7 @@
         <w:t>Verification:</w:t>
       </w:r>
       <w:r>
-        <w:t xml:space="preserve"> Merged S167 passed 125 relay and 897 full-repository tests with one optional skip, exact-image proof, and same-reviewer approval. Corrected code head c158421d18ef5af87a3dc70524a5a00fcc1ec4d6, tree 392314058472ccbae8aa7be19d5d2c64db7aeca9, passed 143 relay and 917 full-repository tests with one skip, plus 24 packaging, containment, official-process, and product-truth tests, Ruff, Pyright, and compile. Real MCP 2.1.1 regressions prove stable repeated-cursor 502 and final-admission 403 outcomes with no dispatch or charge. Re-review remains pending.</w:t>
+        <w:t xml:space="preserve"> Merged S167 passed 125 relay and 897 full-repository tests with one optional skip, exact-image proof, and same-reviewer approval. Corrected code head c158421d18ef5af87a3dc70524a5a00fcc1ec4d6, tree 392314058472ccbae8aa7be19d5d2c64db7aeca9, passed 143 relay and 917 full-repository tests with one skip, plus 24 packaging, containment, official-process, and product-truth tests, Ruff, Pyright, and compile. Real MCP 2.1.1 regressions prove stable repeated-cursor 502 and final-admission 403 outcomes with no dispatch or charge. Reviewer reproduced both and approved.</w:t>
       </w:r>
     </w:p>
     <w:p>

</xml_diff>